<commit_message>
textos implementados no projeto
</commit_message>
<xml_diff>
--- a/api e front.docx
+++ b/api e front.docx
@@ -184,7 +184,7 @@
           <w:lang w:eastAsia="pt-BR"/>
         </w:rPr>
         <w:pict w14:anchorId="3BA2B6BC">
-          <v:rect id="_x0000_i1049" style="width:0;height:1.5pt" o:hralign="center" o:hrstd="t" o:hr="t" fillcolor="#a0a0a0" stroked="f"/>
+          <v:rect id="_x0000_i1313" style="width:0;height:1.5pt" o:hralign="center" o:hrstd="t" o:hr="t" fillcolor="#a0a0a0" stroked="f"/>
         </w:pict>
       </w:r>
     </w:p>
@@ -449,7 +449,7 @@
           <w:lang w:eastAsia="pt-BR"/>
         </w:rPr>
         <w:pict w14:anchorId="6C493105">
-          <v:rect id="_x0000_i1050" style="width:0;height:1.5pt" o:hralign="center" o:hrstd="t" o:hr="t" fillcolor="#a0a0a0" stroked="f"/>
+          <v:rect id="_x0000_i1314" style="width:0;height:1.5pt" o:hralign="center" o:hrstd="t" o:hr="t" fillcolor="#a0a0a0" stroked="f"/>
         </w:pict>
       </w:r>
     </w:p>
@@ -762,7 +762,7 @@
           <w:lang w:eastAsia="pt-BR"/>
         </w:rPr>
         <w:pict w14:anchorId="4EEA8E24">
-          <v:rect id="_x0000_i1051" style="width:0;height:1.5pt" o:hralign="center" o:hrstd="t" o:hr="t" fillcolor="#a0a0a0" stroked="f"/>
+          <v:rect id="_x0000_i1315" style="width:0;height:1.5pt" o:hralign="center" o:hrstd="t" o:hr="t" fillcolor="#a0a0a0" stroked="f"/>
         </w:pict>
       </w:r>
     </w:p>
@@ -1089,7 +1089,7 @@
           <w:lang w:eastAsia="pt-BR"/>
         </w:rPr>
         <w:pict w14:anchorId="175BE8B3">
-          <v:rect id="_x0000_i1052" style="width:0;height:1.5pt" o:hralign="center" o:hrstd="t" o:hr="t" fillcolor="#a0a0a0" stroked="f"/>
+          <v:rect id="_x0000_i1316" style="width:0;height:1.5pt" o:hralign="center" o:hrstd="t" o:hr="t" fillcolor="#a0a0a0" stroked="f"/>
         </w:pict>
       </w:r>
     </w:p>
@@ -4633,6 +4633,7 @@
   <w:num w:numId="22" w16cid:durableId="1219512676">
     <w:abstractNumId w:val="0"/>
   </w:num>
+  <w:numIdMacAtCleanup w:val="54"/>
 </w:numbering>
 </file>
 
@@ -5237,6 +5238,7 @@
   <w:style w:type="character" w:default="1" w:styleId="Fontepargpadro">
     <w:name w:val="Default Paragraph Font"/>
     <w:uiPriority w:val="1"/>
+    <w:semiHidden/>
     <w:unhideWhenUsed/>
   </w:style>
   <w:style w:type="table" w:default="1" w:styleId="Tabelanormal">

</xml_diff>

<commit_message>
pausa na construcao das suites v100 e v32
</commit_message>
<xml_diff>
--- a/api e front.docx
+++ b/api e front.docx
@@ -18,29 +18,7 @@
           <w:szCs w:val="24"/>
           <w:lang w:eastAsia="pt-BR"/>
         </w:rPr>
-        <w:t xml:space="preserve">o projeto ainda </w:t>
-      </w:r>
-      <w:proofErr w:type="spellStart"/>
-      <w:proofErr w:type="gramStart"/>
-      <w:r>
-        <w:rPr>
-          <w:rFonts w:ascii="Segoe UI Emoji" w:eastAsia="Times New Roman" w:hAnsi="Segoe UI Emoji" w:cs="Segoe UI Emoji"/>
-          <w:sz w:val="24"/>
-          <w:szCs w:val="24"/>
-          <w:lang w:eastAsia="pt-BR"/>
-        </w:rPr>
-        <w:t>esta</w:t>
-      </w:r>
-      <w:proofErr w:type="spellEnd"/>
-      <w:proofErr w:type="gramEnd"/>
-      <w:r>
-        <w:rPr>
-          <w:rFonts w:ascii="Segoe UI Emoji" w:eastAsia="Times New Roman" w:hAnsi="Segoe UI Emoji" w:cs="Segoe UI Emoji"/>
-          <w:sz w:val="24"/>
-          <w:szCs w:val="24"/>
-          <w:lang w:eastAsia="pt-BR"/>
-        </w:rPr>
-        <w:t xml:space="preserve"> em desenvolvimento. é melhor concluir a api para depois desenvolver o front ou é melhor fazer api e front ao mesmo tempo?</w:t>
+        <w:t>o projeto ainda esta em desenvolvimento. é melhor concluir a api para depois desenvolver o front ou é melhor fazer api e front ao mesmo tempo?</w:t>
       </w:r>
     </w:p>
     <w:p>
@@ -80,31 +58,7 @@
           <w:szCs w:val="24"/>
           <w:lang w:eastAsia="pt-BR"/>
         </w:rPr>
-        <w:t xml:space="preserve">nem um, nem outro totalmente; o ideal é o desenvolvimento orientado a "fatias" (Vertical </w:t>
-      </w:r>
-      <w:proofErr w:type="spellStart"/>
-      <w:r>
-        <w:rPr>
-          <w:rFonts w:ascii="Segoe UI Emoji" w:eastAsia="Times New Roman" w:hAnsi="Segoe UI Emoji" w:cs="Segoe UI Emoji"/>
-          <w:b/>
-          <w:bCs/>
-          <w:sz w:val="24"/>
-          <w:szCs w:val="24"/>
-          <w:lang w:eastAsia="pt-BR"/>
-        </w:rPr>
-        <w:t>Slices</w:t>
-      </w:r>
-      <w:proofErr w:type="spellEnd"/>
-      <w:r>
-        <w:rPr>
-          <w:rFonts w:ascii="Segoe UI Emoji" w:eastAsia="Times New Roman" w:hAnsi="Segoe UI Emoji" w:cs="Segoe UI Emoji"/>
-          <w:b/>
-          <w:bCs/>
-          <w:sz w:val="24"/>
-          <w:szCs w:val="24"/>
-          <w:lang w:eastAsia="pt-BR"/>
-        </w:rPr>
-        <w:t>).</w:t>
+        <w:t>nem um, nem outro totalmente; o ideal é o desenvolvimento orientado a "fatias" (Vertical Slices).</w:t>
       </w:r>
     </w:p>
     <w:p>
@@ -125,7 +79,6 @@
         </w:rPr>
         <w:t xml:space="preserve">Como seu projeto é um sistema </w:t>
       </w:r>
-      <w:proofErr w:type="spellStart"/>
       <w:r>
         <w:rPr>
           <w:rFonts w:ascii="Segoe UI Emoji" w:eastAsia="Times New Roman" w:hAnsi="Segoe UI Emoji" w:cs="Segoe UI Emoji"/>
@@ -137,7 +90,6 @@
         </w:rPr>
         <w:t>Multi-tenant</w:t>
       </w:r>
-      <w:proofErr w:type="spellEnd"/>
       <w:r>
         <w:rPr>
           <w:rFonts w:ascii="Segoe UI Emoji" w:eastAsia="Times New Roman" w:hAnsi="Segoe UI Emoji" w:cs="Segoe UI Emoji"/>
@@ -184,7 +136,7 @@
           <w:lang w:eastAsia="pt-BR"/>
         </w:rPr>
         <w:pict w14:anchorId="3BA2B6BC">
-          <v:rect id="_x0000_i1313" style="width:0;height:1.5pt" o:hralign="center" o:hrstd="t" o:hr="t" fillcolor="#a0a0a0" stroked="f"/>
+          <v:rect id="_x0000_i1025" style="width:0;height:1.5pt" o:hralign="center" o:hrstd="t" o:hr="t" fillcolor="#a0a0a0" stroked="f"/>
         </w:pict>
       </w:r>
     </w:p>
@@ -281,47 +233,7 @@
           <w:szCs w:val="24"/>
           <w:lang w:eastAsia="pt-BR"/>
         </w:rPr>
-        <w:t xml:space="preserve"> Você escolhe uma funcionalidade pequena (</w:t>
-      </w:r>
-      <w:proofErr w:type="spellStart"/>
-      <w:r>
-        <w:rPr>
-          <w:rFonts w:ascii="Segoe UI Emoji" w:eastAsia="Times New Roman" w:hAnsi="Segoe UI Emoji" w:cs="Segoe UI Emoji"/>
-          <w:sz w:val="24"/>
-          <w:szCs w:val="24"/>
-          <w:lang w:eastAsia="pt-BR"/>
-        </w:rPr>
-        <w:t>ex</w:t>
-      </w:r>
-      <w:proofErr w:type="spellEnd"/>
-      <w:r>
-        <w:rPr>
-          <w:rFonts w:ascii="Segoe UI Emoji" w:eastAsia="Times New Roman" w:hAnsi="Segoe UI Emoji" w:cs="Segoe UI Emoji"/>
-          <w:sz w:val="24"/>
-          <w:szCs w:val="24"/>
-          <w:lang w:eastAsia="pt-BR"/>
-        </w:rPr>
-        <w:t xml:space="preserve">: "Cadastro de Conta no </w:t>
-      </w:r>
-      <w:proofErr w:type="spellStart"/>
-      <w:r>
-        <w:rPr>
-          <w:rFonts w:ascii="Segoe UI Emoji" w:eastAsia="Times New Roman" w:hAnsi="Segoe UI Emoji" w:cs="Segoe UI Emoji"/>
-          <w:sz w:val="24"/>
-          <w:szCs w:val="24"/>
-          <w:lang w:eastAsia="pt-BR"/>
-        </w:rPr>
-        <w:t>Control</w:t>
-      </w:r>
-      <w:proofErr w:type="spellEnd"/>
-      <w:r>
-        <w:rPr>
-          <w:rFonts w:ascii="Segoe UI Emoji" w:eastAsia="Times New Roman" w:hAnsi="Segoe UI Emoji" w:cs="Segoe UI Emoji"/>
-          <w:sz w:val="24"/>
-          <w:szCs w:val="24"/>
-          <w:lang w:eastAsia="pt-BR"/>
-        </w:rPr>
-        <w:t xml:space="preserve"> Plane").</w:t>
+        <w:t xml:space="preserve"> Você escolhe uma funcionalidade pequena (ex: "Cadastro de Conta no Control Plane").</w:t>
       </w:r>
     </w:p>
     <w:p>
@@ -409,27 +321,7 @@
           <w:szCs w:val="24"/>
           <w:lang w:eastAsia="pt-BR"/>
         </w:rPr>
-        <w:t xml:space="preserve"> Você valida o fluxo de dados imediatamente. Se o </w:t>
-      </w:r>
-      <w:proofErr w:type="spellStart"/>
-      <w:r>
-        <w:rPr>
-          <w:rFonts w:ascii="Segoe UI Emoji" w:eastAsia="Times New Roman" w:hAnsi="Segoe UI Emoji" w:cs="Segoe UI Emoji"/>
-          <w:sz w:val="24"/>
-          <w:szCs w:val="24"/>
-          <w:lang w:eastAsia="pt-BR"/>
-        </w:rPr>
-        <w:t>AccountResponse</w:t>
-      </w:r>
-      <w:proofErr w:type="spellEnd"/>
-      <w:r>
-        <w:rPr>
-          <w:rFonts w:ascii="Segoe UI Emoji" w:eastAsia="Times New Roman" w:hAnsi="Segoe UI Emoji" w:cs="Segoe UI Emoji"/>
-          <w:sz w:val="24"/>
-          <w:szCs w:val="24"/>
-          <w:lang w:eastAsia="pt-BR"/>
-        </w:rPr>
-        <w:t xml:space="preserve"> da API estiver faltando um campo necessário para o design do Front, você descobre em 5 minutos, e não em 5 meses.</w:t>
+        <w:t xml:space="preserve"> Você valida o fluxo de dados imediatamente. Se o AccountResponse da API estiver faltando um campo necessário para o design do Front, você descobre em 5 minutos, e não em 5 meses.</w:t>
       </w:r>
     </w:p>
     <w:p>
@@ -449,7 +341,7 @@
           <w:lang w:eastAsia="pt-BR"/>
         </w:rPr>
         <w:pict w14:anchorId="6C493105">
-          <v:rect id="_x0000_i1314" style="width:0;height:1.5pt" o:hralign="center" o:hrstd="t" o:hr="t" fillcolor="#a0a0a0" stroked="f"/>
+          <v:rect id="_x0000_i1026" style="width:0;height:1.5pt" o:hralign="center" o:hrstd="t" o:hr="t" fillcolor="#a0a0a0" stroked="f"/>
         </w:pict>
       </w:r>
     </w:p>
@@ -498,31 +390,7 @@
           <w:szCs w:val="24"/>
           <w:lang w:eastAsia="pt-BR"/>
         </w:rPr>
-        <w:t>Over-</w:t>
-      </w:r>
-      <w:proofErr w:type="spellStart"/>
-      <w:r>
-        <w:rPr>
-          <w:rFonts w:ascii="Segoe UI Emoji" w:eastAsia="Times New Roman" w:hAnsi="Segoe UI Emoji" w:cs="Segoe UI Emoji"/>
-          <w:b/>
-          <w:bCs/>
-          <w:sz w:val="24"/>
-          <w:szCs w:val="24"/>
-          <w:lang w:eastAsia="pt-BR"/>
-        </w:rPr>
-        <w:t>engineering</w:t>
-      </w:r>
-      <w:proofErr w:type="spellEnd"/>
-      <w:r>
-        <w:rPr>
-          <w:rFonts w:ascii="Segoe UI Emoji" w:eastAsia="Times New Roman" w:hAnsi="Segoe UI Emoji" w:cs="Segoe UI Emoji"/>
-          <w:b/>
-          <w:bCs/>
-          <w:sz w:val="24"/>
-          <w:szCs w:val="24"/>
-          <w:lang w:eastAsia="pt-BR"/>
-        </w:rPr>
-        <w:t>:</w:t>
+        <w:t>Over-engineering:</w:t>
       </w:r>
       <w:r>
         <w:rPr>
@@ -531,27 +399,7 @@
           <w:szCs w:val="24"/>
           <w:lang w:eastAsia="pt-BR"/>
         </w:rPr>
-        <w:t xml:space="preserve"> Você pode criar 50 </w:t>
-      </w:r>
-      <w:proofErr w:type="spellStart"/>
-      <w:r>
-        <w:rPr>
-          <w:rFonts w:ascii="Segoe UI Emoji" w:eastAsia="Times New Roman" w:hAnsi="Segoe UI Emoji" w:cs="Segoe UI Emoji"/>
-          <w:sz w:val="24"/>
-          <w:szCs w:val="24"/>
-          <w:lang w:eastAsia="pt-BR"/>
-        </w:rPr>
-        <w:t>endpoints</w:t>
-      </w:r>
-      <w:proofErr w:type="spellEnd"/>
-      <w:r>
-        <w:rPr>
-          <w:rFonts w:ascii="Segoe UI Emoji" w:eastAsia="Times New Roman" w:hAnsi="Segoe UI Emoji" w:cs="Segoe UI Emoji"/>
-          <w:sz w:val="24"/>
-          <w:szCs w:val="24"/>
-          <w:lang w:eastAsia="pt-BR"/>
-        </w:rPr>
-        <w:t xml:space="preserve"> que acha que são úteis, mas quando chegar no Front, perceberá que precisava apenas de 10, mas com estruturas de JSON diferentes.</w:t>
+        <w:t xml:space="preserve"> Você pode criar 50 endpoints que acha que são úteis, mas quando chegar no Front, perceberá que precisava apenas de 10, mas com estruturas de JSON diferentes.</w:t>
       </w:r>
     </w:p>
     <w:p>
@@ -585,47 +433,7 @@
           <w:szCs w:val="24"/>
           <w:lang w:eastAsia="pt-BR"/>
         </w:rPr>
-        <w:t xml:space="preserve"> O comportamento do </w:t>
-      </w:r>
-      <w:proofErr w:type="spellStart"/>
-      <w:r>
-        <w:rPr>
-          <w:rFonts w:ascii="Segoe UI Emoji" w:eastAsia="Times New Roman" w:hAnsi="Segoe UI Emoji" w:cs="Segoe UI Emoji"/>
-          <w:sz w:val="24"/>
-          <w:szCs w:val="24"/>
-          <w:lang w:eastAsia="pt-BR"/>
-        </w:rPr>
-        <w:t>multi-tenancy</w:t>
-      </w:r>
-      <w:proofErr w:type="spellEnd"/>
-      <w:r>
-        <w:rPr>
-          <w:rFonts w:ascii="Segoe UI Emoji" w:eastAsia="Times New Roman" w:hAnsi="Segoe UI Emoji" w:cs="Segoe UI Emoji"/>
-          <w:sz w:val="24"/>
-          <w:szCs w:val="24"/>
-          <w:lang w:eastAsia="pt-BR"/>
-        </w:rPr>
-        <w:t xml:space="preserve"> (troca de </w:t>
-      </w:r>
-      <w:proofErr w:type="spellStart"/>
-      <w:r>
-        <w:rPr>
-          <w:rFonts w:ascii="Segoe UI Emoji" w:eastAsia="Times New Roman" w:hAnsi="Segoe UI Emoji" w:cs="Segoe UI Emoji"/>
-          <w:sz w:val="24"/>
-          <w:szCs w:val="24"/>
-          <w:lang w:eastAsia="pt-BR"/>
-        </w:rPr>
-        <w:t>schema</w:t>
-      </w:r>
-      <w:proofErr w:type="spellEnd"/>
-      <w:r>
-        <w:rPr>
-          <w:rFonts w:ascii="Segoe UI Emoji" w:eastAsia="Times New Roman" w:hAnsi="Segoe UI Emoji" w:cs="Segoe UI Emoji"/>
-          <w:sz w:val="24"/>
-          <w:szCs w:val="24"/>
-          <w:lang w:eastAsia="pt-BR"/>
-        </w:rPr>
-        <w:t>) é algo que o usuário sente no Front. Se houver um delay na troca de contexto, você só notará isso quando o Front estiver pronto.</w:t>
+        <w:t xml:space="preserve"> O comportamento do multi-tenancy (troca de schema) é algo que o usuário sente no Front. Se houver um delay na troca de contexto, você só notará isso quando o Front estiver pronto.</w:t>
       </w:r>
     </w:p>
     <w:p>
@@ -682,67 +490,7 @@
           <w:szCs w:val="24"/>
           <w:lang w:eastAsia="pt-BR"/>
         </w:rPr>
-        <w:t xml:space="preserve"> Mudar de Java (</w:t>
-      </w:r>
-      <w:proofErr w:type="spellStart"/>
-      <w:r>
-        <w:rPr>
-          <w:rFonts w:ascii="Segoe UI Emoji" w:eastAsia="Times New Roman" w:hAnsi="Segoe UI Emoji" w:cs="Segoe UI Emoji"/>
-          <w:sz w:val="24"/>
-          <w:szCs w:val="24"/>
-          <w:lang w:eastAsia="pt-BR"/>
-        </w:rPr>
-        <w:t>Backend</w:t>
-      </w:r>
-      <w:proofErr w:type="spellEnd"/>
-      <w:r>
-        <w:rPr>
-          <w:rFonts w:ascii="Segoe UI Emoji" w:eastAsia="Times New Roman" w:hAnsi="Segoe UI Emoji" w:cs="Segoe UI Emoji"/>
-          <w:sz w:val="24"/>
-          <w:szCs w:val="24"/>
-          <w:lang w:eastAsia="pt-BR"/>
-        </w:rPr>
-        <w:t xml:space="preserve">) para </w:t>
-      </w:r>
-      <w:proofErr w:type="spellStart"/>
-      <w:r>
-        <w:rPr>
-          <w:rFonts w:ascii="Segoe UI Emoji" w:eastAsia="Times New Roman" w:hAnsi="Segoe UI Emoji" w:cs="Segoe UI Emoji"/>
-          <w:sz w:val="24"/>
-          <w:szCs w:val="24"/>
-          <w:lang w:eastAsia="pt-BR"/>
-        </w:rPr>
-        <w:t>React</w:t>
-      </w:r>
-      <w:proofErr w:type="spellEnd"/>
-      <w:r>
-        <w:rPr>
-          <w:rFonts w:ascii="Segoe UI Emoji" w:eastAsia="Times New Roman" w:hAnsi="Segoe UI Emoji" w:cs="Segoe UI Emoji"/>
-          <w:sz w:val="24"/>
-          <w:szCs w:val="24"/>
-          <w:lang w:eastAsia="pt-BR"/>
-        </w:rPr>
-        <w:t>/Angular (</w:t>
-      </w:r>
-      <w:proofErr w:type="spellStart"/>
-      <w:r>
-        <w:rPr>
-          <w:rFonts w:ascii="Segoe UI Emoji" w:eastAsia="Times New Roman" w:hAnsi="Segoe UI Emoji" w:cs="Segoe UI Emoji"/>
-          <w:sz w:val="24"/>
-          <w:szCs w:val="24"/>
-          <w:lang w:eastAsia="pt-BR"/>
-        </w:rPr>
-        <w:t>Frontend</w:t>
-      </w:r>
-      <w:proofErr w:type="spellEnd"/>
-      <w:r>
-        <w:rPr>
-          <w:rFonts w:ascii="Segoe UI Emoji" w:eastAsia="Times New Roman" w:hAnsi="Segoe UI Emoji" w:cs="Segoe UI Emoji"/>
-          <w:sz w:val="24"/>
-          <w:szCs w:val="24"/>
-          <w:lang w:eastAsia="pt-BR"/>
-        </w:rPr>
-        <w:t>) a cada 10 minutos cansa o cérebro e gera erros.</w:t>
+        <w:t xml:space="preserve"> Mudar de Java (Backend) para React/Angular (Frontend) a cada 10 minutos cansa o cérebro e gera erros.</w:t>
       </w:r>
     </w:p>
     <w:p>
@@ -762,7 +510,7 @@
           <w:lang w:eastAsia="pt-BR"/>
         </w:rPr>
         <w:pict w14:anchorId="4EEA8E24">
-          <v:rect id="_x0000_i1315" style="width:0;height:1.5pt" o:hralign="center" o:hrstd="t" o:hr="t" fillcolor="#a0a0a0" stroked="f"/>
+          <v:rect id="_x0000_i1027" style="width:0;height:1.5pt" o:hralign="center" o:hrstd="t" o:hr="t" fillcolor="#a0a0a0" stroked="f"/>
         </w:pict>
       </w:r>
     </w:p>
@@ -830,31 +578,7 @@
           <w:szCs w:val="24"/>
           <w:lang w:eastAsia="pt-BR"/>
         </w:rPr>
-        <w:t xml:space="preserve">Contrato Primeiro (Design </w:t>
-      </w:r>
-      <w:proofErr w:type="spellStart"/>
-      <w:r>
-        <w:rPr>
-          <w:rFonts w:ascii="Segoe UI Emoji" w:eastAsia="Times New Roman" w:hAnsi="Segoe UI Emoji" w:cs="Segoe UI Emoji"/>
-          <w:b/>
-          <w:bCs/>
-          <w:sz w:val="24"/>
-          <w:szCs w:val="24"/>
-          <w:lang w:eastAsia="pt-BR"/>
-        </w:rPr>
-        <w:t>First</w:t>
-      </w:r>
-      <w:proofErr w:type="spellEnd"/>
-      <w:r>
-        <w:rPr>
-          <w:rFonts w:ascii="Segoe UI Emoji" w:eastAsia="Times New Roman" w:hAnsi="Segoe UI Emoji" w:cs="Segoe UI Emoji"/>
-          <w:b/>
-          <w:bCs/>
-          <w:sz w:val="24"/>
-          <w:szCs w:val="24"/>
-          <w:lang w:eastAsia="pt-BR"/>
-        </w:rPr>
-        <w:t>):</w:t>
+        <w:t>Contrato Primeiro (Design First):</w:t>
       </w:r>
       <w:r>
         <w:rPr>
@@ -888,31 +612,7 @@
           <w:szCs w:val="24"/>
           <w:lang w:eastAsia="pt-BR"/>
         </w:rPr>
-        <w:t xml:space="preserve">API </w:t>
-      </w:r>
-      <w:proofErr w:type="spellStart"/>
-      <w:r>
-        <w:rPr>
-          <w:rFonts w:ascii="Segoe UI Emoji" w:eastAsia="Times New Roman" w:hAnsi="Segoe UI Emoji" w:cs="Segoe UI Emoji"/>
-          <w:b/>
-          <w:bCs/>
-          <w:sz w:val="24"/>
-          <w:szCs w:val="24"/>
-          <w:lang w:eastAsia="pt-BR"/>
-        </w:rPr>
-        <w:t>Mockada</w:t>
-      </w:r>
-      <w:proofErr w:type="spellEnd"/>
-      <w:r>
-        <w:rPr>
-          <w:rFonts w:ascii="Segoe UI Emoji" w:eastAsia="Times New Roman" w:hAnsi="Segoe UI Emoji" w:cs="Segoe UI Emoji"/>
-          <w:b/>
-          <w:bCs/>
-          <w:sz w:val="24"/>
-          <w:szCs w:val="24"/>
-          <w:lang w:eastAsia="pt-BR"/>
-        </w:rPr>
-        <w:t xml:space="preserve"> ou Básica:</w:t>
+        <w:t>API Mockada ou Básica:</w:t>
       </w:r>
       <w:r>
         <w:rPr>
@@ -921,27 +621,7 @@
           <w:szCs w:val="24"/>
           <w:lang w:eastAsia="pt-BR"/>
         </w:rPr>
-        <w:t xml:space="preserve"> Crie o </w:t>
-      </w:r>
-      <w:proofErr w:type="spellStart"/>
-      <w:r>
-        <w:rPr>
-          <w:rFonts w:ascii="Segoe UI Emoji" w:eastAsia="Times New Roman" w:hAnsi="Segoe UI Emoji" w:cs="Segoe UI Emoji"/>
-          <w:sz w:val="24"/>
-          <w:szCs w:val="24"/>
-          <w:lang w:eastAsia="pt-BR"/>
-        </w:rPr>
-        <w:t>Controller</w:t>
-      </w:r>
-      <w:proofErr w:type="spellEnd"/>
-      <w:r>
-        <w:rPr>
-          <w:rFonts w:ascii="Segoe UI Emoji" w:eastAsia="Times New Roman" w:hAnsi="Segoe UI Emoji" w:cs="Segoe UI Emoji"/>
-          <w:sz w:val="24"/>
-          <w:szCs w:val="24"/>
-          <w:lang w:eastAsia="pt-BR"/>
-        </w:rPr>
-        <w:t xml:space="preserve"> e o Service com o retorno básico (mesmo que com dados fixos).</w:t>
+        <w:t xml:space="preserve"> Crie o Controller e o Service com o retorno básico (mesmo que com dados fixos).</w:t>
       </w:r>
     </w:p>
     <w:p>
@@ -975,67 +655,7 @@
           <w:szCs w:val="24"/>
           <w:lang w:eastAsia="pt-BR"/>
         </w:rPr>
-        <w:t xml:space="preserve"> Conecte o Front nessa API. Se a experiência for boa, você "abre o capô" do </w:t>
-      </w:r>
-      <w:proofErr w:type="spellStart"/>
-      <w:r>
-        <w:rPr>
-          <w:rFonts w:ascii="Segoe UI Emoji" w:eastAsia="Times New Roman" w:hAnsi="Segoe UI Emoji" w:cs="Segoe UI Emoji"/>
-          <w:sz w:val="24"/>
-          <w:szCs w:val="24"/>
-          <w:lang w:eastAsia="pt-BR"/>
-        </w:rPr>
-        <w:t>Backend</w:t>
-      </w:r>
-      <w:proofErr w:type="spellEnd"/>
-      <w:r>
-        <w:rPr>
-          <w:rFonts w:ascii="Segoe UI Emoji" w:eastAsia="Times New Roman" w:hAnsi="Segoe UI Emoji" w:cs="Segoe UI Emoji"/>
-          <w:sz w:val="24"/>
-          <w:szCs w:val="24"/>
-          <w:lang w:eastAsia="pt-BR"/>
-        </w:rPr>
-        <w:t xml:space="preserve"> e finaliza a lógica complexa (JPA, </w:t>
-      </w:r>
-      <w:proofErr w:type="spellStart"/>
-      <w:r>
-        <w:rPr>
-          <w:rFonts w:ascii="Segoe UI Emoji" w:eastAsia="Times New Roman" w:hAnsi="Segoe UI Emoji" w:cs="Segoe UI Emoji"/>
-          <w:sz w:val="24"/>
-          <w:szCs w:val="24"/>
-          <w:lang w:eastAsia="pt-BR"/>
-        </w:rPr>
-        <w:t>Multi-tenancy</w:t>
-      </w:r>
-      <w:proofErr w:type="spellEnd"/>
-      <w:r>
-        <w:rPr>
-          <w:rFonts w:ascii="Segoe UI Emoji" w:eastAsia="Times New Roman" w:hAnsi="Segoe UI Emoji" w:cs="Segoe UI Emoji"/>
-          <w:sz w:val="24"/>
-          <w:szCs w:val="24"/>
-          <w:lang w:eastAsia="pt-BR"/>
-        </w:rPr>
-        <w:t xml:space="preserve">, </w:t>
-      </w:r>
-      <w:proofErr w:type="spellStart"/>
-      <w:r>
-        <w:rPr>
-          <w:rFonts w:ascii="Segoe UI Emoji" w:eastAsia="Times New Roman" w:hAnsi="Segoe UI Emoji" w:cs="Segoe UI Emoji"/>
-          <w:sz w:val="24"/>
-          <w:szCs w:val="24"/>
-          <w:lang w:eastAsia="pt-BR"/>
-        </w:rPr>
-        <w:t>Flyway</w:t>
-      </w:r>
-      <w:proofErr w:type="spellEnd"/>
-      <w:r>
-        <w:rPr>
-          <w:rFonts w:ascii="Segoe UI Emoji" w:eastAsia="Times New Roman" w:hAnsi="Segoe UI Emoji" w:cs="Segoe UI Emoji"/>
-          <w:sz w:val="24"/>
-          <w:szCs w:val="24"/>
-          <w:lang w:eastAsia="pt-BR"/>
-        </w:rPr>
-        <w:t>).</w:t>
+        <w:t xml:space="preserve"> Conecte o Front nessa API. Se a experiência for boa, você "abre o capô" do Backend e finaliza a lógica complexa (JPA, Multi-tenancy, Flyway).</w:t>
       </w:r>
     </w:p>
     <w:p>
@@ -1089,7 +709,7 @@
           <w:lang w:eastAsia="pt-BR"/>
         </w:rPr>
         <w:pict w14:anchorId="175BE8B3">
-          <v:rect id="_x0000_i1316" style="width:0;height:1.5pt" o:hralign="center" o:hrstd="t" o:hr="t" fillcolor="#a0a0a0" stroked="f"/>
+          <v:rect id="_x0000_i1028" style="width:0;height:1.5pt" o:hralign="center" o:hrstd="t" o:hr="t" fillcolor="#a0a0a0" stroked="f"/>
         </w:pict>
       </w:r>
     </w:p>
@@ -1132,27 +752,7 @@
           <w:szCs w:val="24"/>
           <w:lang w:eastAsia="pt-BR"/>
         </w:rPr>
-        <w:t xml:space="preserve">Como você ainda está refatorando muito o </w:t>
-      </w:r>
-      <w:proofErr w:type="spellStart"/>
-      <w:r>
-        <w:rPr>
-          <w:rFonts w:ascii="Segoe UI Emoji" w:eastAsia="Times New Roman" w:hAnsi="Segoe UI Emoji" w:cs="Segoe UI Emoji"/>
-          <w:sz w:val="24"/>
-          <w:szCs w:val="24"/>
-          <w:lang w:eastAsia="pt-BR"/>
-        </w:rPr>
-        <w:t>backend</w:t>
-      </w:r>
-      <w:proofErr w:type="spellEnd"/>
-      <w:r>
-        <w:rPr>
-          <w:rFonts w:ascii="Segoe UI Emoji" w:eastAsia="Times New Roman" w:hAnsi="Segoe UI Emoji" w:cs="Segoe UI Emoji"/>
-          <w:sz w:val="24"/>
-          <w:szCs w:val="24"/>
-          <w:lang w:eastAsia="pt-BR"/>
-        </w:rPr>
-        <w:t xml:space="preserve"> e as coisas estão "quebrando", </w:t>
+        <w:t xml:space="preserve">Como você ainda está refatorando muito o backend e as coisas estão "quebrando", </w:t>
       </w:r>
       <w:r>
         <w:rPr>
@@ -1163,31 +763,7 @@
           <w:szCs w:val="24"/>
           <w:lang w:eastAsia="pt-BR"/>
         </w:rPr>
-        <w:t xml:space="preserve">focar um pouco mais no </w:t>
-      </w:r>
-      <w:proofErr w:type="spellStart"/>
-      <w:r>
-        <w:rPr>
-          <w:rFonts w:ascii="Segoe UI Emoji" w:eastAsia="Times New Roman" w:hAnsi="Segoe UI Emoji" w:cs="Segoe UI Emoji"/>
-          <w:b/>
-          <w:bCs/>
-          <w:sz w:val="24"/>
-          <w:szCs w:val="24"/>
-          <w:lang w:eastAsia="pt-BR"/>
-        </w:rPr>
-        <w:t>Backend</w:t>
-      </w:r>
-      <w:proofErr w:type="spellEnd"/>
-      <w:r>
-        <w:rPr>
-          <w:rFonts w:ascii="Segoe UI Emoji" w:eastAsia="Times New Roman" w:hAnsi="Segoe UI Emoji" w:cs="Segoe UI Emoji"/>
-          <w:b/>
-          <w:bCs/>
-          <w:sz w:val="24"/>
-          <w:szCs w:val="24"/>
-          <w:lang w:eastAsia="pt-BR"/>
-        </w:rPr>
-        <w:t xml:space="preserve"> agora é prudente</w:t>
+        <w:t>focar um pouco mais no Backend agora é prudente</w:t>
       </w:r>
       <w:r>
         <w:rPr>
@@ -1216,27 +792,7 @@
           <w:szCs w:val="24"/>
           <w:lang w:eastAsia="pt-BR"/>
         </w:rPr>
-        <w:t xml:space="preserve"> (Segurança + Troca de </w:t>
-      </w:r>
-      <w:proofErr w:type="spellStart"/>
-      <w:r>
-        <w:rPr>
-          <w:rFonts w:ascii="Segoe UI Emoji" w:eastAsia="Times New Roman" w:hAnsi="Segoe UI Emoji" w:cs="Segoe UI Emoji"/>
-          <w:sz w:val="24"/>
-          <w:szCs w:val="24"/>
-          <w:lang w:eastAsia="pt-BR"/>
-        </w:rPr>
-        <w:t>Schema</w:t>
-      </w:r>
-      <w:proofErr w:type="spellEnd"/>
-      <w:r>
-        <w:rPr>
-          <w:rFonts w:ascii="Segoe UI Emoji" w:eastAsia="Times New Roman" w:hAnsi="Segoe UI Emoji" w:cs="Segoe UI Emoji"/>
-          <w:sz w:val="24"/>
-          <w:szCs w:val="24"/>
-          <w:lang w:eastAsia="pt-BR"/>
-        </w:rPr>
-        <w:t>) estável.</w:t>
+        <w:t xml:space="preserve"> (Segurança + Troca de Schema) estável.</w:t>
       </w:r>
     </w:p>
     <w:p>
@@ -1255,27 +811,7 @@
           <w:szCs w:val="24"/>
           <w:lang w:eastAsia="pt-BR"/>
         </w:rPr>
-        <w:t xml:space="preserve">Assim que o login e a identificação do </w:t>
-      </w:r>
-      <w:proofErr w:type="spellStart"/>
-      <w:r>
-        <w:rPr>
-          <w:rFonts w:ascii="Segoe UI Emoji" w:eastAsia="Times New Roman" w:hAnsi="Segoe UI Emoji" w:cs="Segoe UI Emoji"/>
-          <w:sz w:val="24"/>
-          <w:szCs w:val="24"/>
-          <w:lang w:eastAsia="pt-BR"/>
-        </w:rPr>
-        <w:t>Tenant</w:t>
-      </w:r>
-      <w:proofErr w:type="spellEnd"/>
-      <w:r>
-        <w:rPr>
-          <w:rFonts w:ascii="Segoe UI Emoji" w:eastAsia="Times New Roman" w:hAnsi="Segoe UI Emoji" w:cs="Segoe UI Emoji"/>
-          <w:sz w:val="24"/>
-          <w:szCs w:val="24"/>
-          <w:lang w:eastAsia="pt-BR"/>
-        </w:rPr>
-        <w:t xml:space="preserve"> estiverem sólidos, mude para o modelo de </w:t>
+        <w:t xml:space="preserve">Assim que o login e a identificação do Tenant estiverem sólidos, mude para o modelo de </w:t>
       </w:r>
       <w:r>
         <w:rPr>

</xml_diff>